<commit_message>
fix(tables): update Table 2 with confirmed microbial species IDs in italics for OOS-262289
</commit_message>
<xml_diff>
--- a/Tables OOS-262289 Link Pharmacy (E19112) - ScanRDI.docx
+++ b/Tables OOS-262289 Link Pharmacy (E19112) - ScanRDI.docx
@@ -447,7 +447,7 @@
         </w:tc>
         <w:tc>
           <w:tcPr>
-            <w:tcW w:type="dxa" w:w="936"/>
+            <w:tcW w:type="dxa" w:w="792"/>
             <w:vAlign w:val="center"/>
             <w:tcMar>
               <w:top w:w="35" w:type="dxa"/>
@@ -474,7 +474,7 @@
         </w:tc>
         <w:tc>
           <w:tcPr>
-            <w:tcW w:type="dxa" w:w="1008"/>
+            <w:tcW w:type="dxa" w:w="864"/>
             <w:vAlign w:val="center"/>
             <w:tcMar>
               <w:top w:w="35" w:type="dxa"/>
@@ -503,7 +503,7 @@
         </w:tc>
         <w:tc>
           <w:tcPr>
-            <w:tcW w:type="dxa" w:w="792"/>
+            <w:tcW w:type="dxa" w:w="720"/>
             <w:vAlign w:val="center"/>
             <w:tcMar>
               <w:top w:w="35" w:type="dxa"/>
@@ -530,7 +530,7 @@
         </w:tc>
         <w:tc>
           <w:tcPr>
-            <w:tcW w:type="dxa" w:w="1656"/>
+            <w:tcW w:type="dxa" w:w="1368"/>
             <w:vAlign w:val="center"/>
             <w:tcMar>
               <w:top w:w="35" w:type="dxa"/>
@@ -557,7 +557,7 @@
         </w:tc>
         <w:tc>
           <w:tcPr>
-            <w:tcW w:type="dxa" w:w="1656"/>
+            <w:tcW w:type="dxa" w:w="1368"/>
             <w:vAlign w:val="center"/>
             <w:tcMar>
               <w:top w:w="35" w:type="dxa"/>
@@ -584,7 +584,7 @@
         </w:tc>
         <w:tc>
           <w:tcPr>
-            <w:tcW w:type="dxa" w:w="1224"/>
+            <w:tcW w:type="dxa" w:w="1296"/>
             <w:vAlign w:val="center"/>
             <w:tcMar>
               <w:top w:w="35" w:type="dxa"/>
@@ -613,7 +613,7 @@
         </w:tc>
         <w:tc>
           <w:tcPr>
-            <w:tcW w:type="dxa" w:w="1152"/>
+            <w:tcW w:type="dxa" w:w="2016"/>
             <w:vAlign w:val="center"/>
             <w:tcMar>
               <w:top w:w="35" w:type="dxa"/>
@@ -729,7 +729,7 @@
         </w:tc>
         <w:tc>
           <w:tcPr>
-            <w:tcW w:type="dxa" w:w="936"/>
+            <w:tcW w:type="dxa" w:w="792"/>
             <w:vAlign w:val="center"/>
             <w:tcMar>
               <w:top w:w="35" w:type="dxa"/>
@@ -756,7 +756,7 @@
         </w:tc>
         <w:tc>
           <w:tcPr>
-            <w:tcW w:type="dxa" w:w="1008"/>
+            <w:tcW w:type="dxa" w:w="864"/>
             <w:vAlign w:val="center"/>
             <w:tcMar>
               <w:top w:w="35" w:type="dxa"/>
@@ -783,7 +783,7 @@
         </w:tc>
         <w:tc>
           <w:tcPr>
-            <w:tcW w:type="dxa" w:w="792"/>
+            <w:tcW w:type="dxa" w:w="720"/>
             <w:vAlign w:val="center"/>
             <w:tcMar>
               <w:top w:w="35" w:type="dxa"/>
@@ -810,7 +810,7 @@
         </w:tc>
         <w:tc>
           <w:tcPr>
-            <w:tcW w:type="dxa" w:w="1656"/>
+            <w:tcW w:type="dxa" w:w="1368"/>
             <w:vAlign w:val="center"/>
             <w:tcMar>
               <w:top w:w="35" w:type="dxa"/>
@@ -839,7 +839,7 @@
         </w:tc>
         <w:tc>
           <w:tcPr>
-            <w:tcW w:type="dxa" w:w="1656"/>
+            <w:tcW w:type="dxa" w:w="1368"/>
             <w:vAlign w:val="center"/>
             <w:tcMar>
               <w:top w:w="35" w:type="dxa"/>
@@ -866,7 +866,7 @@
         </w:tc>
         <w:tc>
           <w:tcPr>
-            <w:tcW w:type="dxa" w:w="1224"/>
+            <w:tcW w:type="dxa" w:w="1296"/>
             <w:vAlign w:val="center"/>
             <w:tcMar>
               <w:top w:w="35" w:type="dxa"/>
@@ -893,7 +893,7 @@
         </w:tc>
         <w:tc>
           <w:tcPr>
-            <w:tcW w:type="dxa" w:w="1152"/>
+            <w:tcW w:type="dxa" w:w="2016"/>
             <w:vAlign w:val="center"/>
             <w:tcMar>
               <w:top w:w="35" w:type="dxa"/>
@@ -978,7 +978,7 @@
         </w:tc>
         <w:tc>
           <w:tcPr>
-            <w:tcW w:type="dxa" w:w="936"/>
+            <w:tcW w:type="dxa" w:w="792"/>
             <w:vAlign w:val="center"/>
             <w:tcMar>
               <w:top w:w="35" w:type="dxa"/>
@@ -1005,7 +1005,7 @@
         </w:tc>
         <w:tc>
           <w:tcPr>
-            <w:tcW w:type="dxa" w:w="1008"/>
+            <w:tcW w:type="dxa" w:w="864"/>
             <w:vAlign w:val="center"/>
             <w:tcMar>
               <w:top w:w="35" w:type="dxa"/>
@@ -1032,7 +1032,7 @@
         </w:tc>
         <w:tc>
           <w:tcPr>
-            <w:tcW w:type="dxa" w:w="792"/>
+            <w:tcW w:type="dxa" w:w="720"/>
             <w:vAlign w:val="center"/>
             <w:tcMar>
               <w:top w:w="35" w:type="dxa"/>
@@ -1059,7 +1059,7 @@
         </w:tc>
         <w:tc>
           <w:tcPr>
-            <w:tcW w:type="dxa" w:w="1656"/>
+            <w:tcW w:type="dxa" w:w="1368"/>
             <w:vAlign w:val="center"/>
             <w:tcMar>
               <w:top w:w="35" w:type="dxa"/>
@@ -1088,7 +1088,7 @@
         </w:tc>
         <w:tc>
           <w:tcPr>
-            <w:tcW w:type="dxa" w:w="1656"/>
+            <w:tcW w:type="dxa" w:w="1368"/>
             <w:vAlign w:val="center"/>
             <w:tcMar>
               <w:top w:w="35" w:type="dxa"/>
@@ -1115,7 +1115,7 @@
         </w:tc>
         <w:tc>
           <w:tcPr>
-            <w:tcW w:type="dxa" w:w="1224"/>
+            <w:tcW w:type="dxa" w:w="1296"/>
             <w:vAlign w:val="center"/>
             <w:tcMar>
               <w:top w:w="35" w:type="dxa"/>
@@ -1142,7 +1142,7 @@
         </w:tc>
         <w:tc>
           <w:tcPr>
-            <w:tcW w:type="dxa" w:w="1152"/>
+            <w:tcW w:type="dxa" w:w="2016"/>
             <w:vAlign w:val="center"/>
             <w:tcMar>
               <w:top w:w="35" w:type="dxa"/>
@@ -1260,7 +1260,7 @@
         </w:tc>
         <w:tc>
           <w:tcPr>
-            <w:tcW w:type="dxa" w:w="936"/>
+            <w:tcW w:type="dxa" w:w="792"/>
             <w:vAlign w:val="center"/>
             <w:tcMar>
               <w:top w:w="35" w:type="dxa"/>
@@ -1287,7 +1287,7 @@
         </w:tc>
         <w:tc>
           <w:tcPr>
-            <w:tcW w:type="dxa" w:w="1008"/>
+            <w:tcW w:type="dxa" w:w="864"/>
             <w:vAlign w:val="center"/>
             <w:tcMar>
               <w:top w:w="35" w:type="dxa"/>
@@ -1314,7 +1314,7 @@
         </w:tc>
         <w:tc>
           <w:tcPr>
-            <w:tcW w:type="dxa" w:w="792"/>
+            <w:tcW w:type="dxa" w:w="720"/>
             <w:vAlign w:val="center"/>
             <w:tcMar>
               <w:top w:w="35" w:type="dxa"/>
@@ -1341,7 +1341,7 @@
         </w:tc>
         <w:tc>
           <w:tcPr>
-            <w:tcW w:type="dxa" w:w="1656"/>
+            <w:tcW w:type="dxa" w:w="1368"/>
             <w:vAlign w:val="center"/>
             <w:tcMar>
               <w:top w:w="35" w:type="dxa"/>
@@ -1370,7 +1370,7 @@
         </w:tc>
         <w:tc>
           <w:tcPr>
-            <w:tcW w:type="dxa" w:w="1656"/>
+            <w:tcW w:type="dxa" w:w="1368"/>
             <w:vAlign w:val="center"/>
             <w:tcMar>
               <w:top w:w="35" w:type="dxa"/>
@@ -1397,7 +1397,7 @@
         </w:tc>
         <w:tc>
           <w:tcPr>
-            <w:tcW w:type="dxa" w:w="1224"/>
+            <w:tcW w:type="dxa" w:w="1296"/>
             <w:vAlign w:val="center"/>
             <w:tcMar>
               <w:top w:w="35" w:type="dxa"/>
@@ -1424,7 +1424,7 @@
         </w:tc>
         <w:tc>
           <w:tcPr>
-            <w:tcW w:type="dxa" w:w="1152"/>
+            <w:tcW w:type="dxa" w:w="2016"/>
             <w:vAlign w:val="center"/>
             <w:tcMar>
               <w:top w:w="35" w:type="dxa"/>
@@ -1511,7 +1511,7 @@
         </w:tc>
         <w:tc>
           <w:tcPr>
-            <w:tcW w:type="dxa" w:w="936"/>
+            <w:tcW w:type="dxa" w:w="792"/>
             <w:vAlign w:val="center"/>
             <w:tcMar>
               <w:top w:w="35" w:type="dxa"/>
@@ -1538,7 +1538,7 @@
         </w:tc>
         <w:tc>
           <w:tcPr>
-            <w:tcW w:type="dxa" w:w="1008"/>
+            <w:tcW w:type="dxa" w:w="864"/>
             <w:vAlign w:val="center"/>
             <w:tcMar>
               <w:top w:w="35" w:type="dxa"/>
@@ -1565,7 +1565,7 @@
         </w:tc>
         <w:tc>
           <w:tcPr>
-            <w:tcW w:type="dxa" w:w="792"/>
+            <w:tcW w:type="dxa" w:w="720"/>
             <w:vAlign w:val="center"/>
             <w:tcMar>
               <w:top w:w="35" w:type="dxa"/>
@@ -1592,7 +1592,7 @@
         </w:tc>
         <w:tc>
           <w:tcPr>
-            <w:tcW w:type="dxa" w:w="1656"/>
+            <w:tcW w:type="dxa" w:w="1368"/>
             <w:vAlign w:val="center"/>
             <w:tcMar>
               <w:top w:w="35" w:type="dxa"/>
@@ -1621,7 +1621,7 @@
         </w:tc>
         <w:tc>
           <w:tcPr>
-            <w:tcW w:type="dxa" w:w="1656"/>
+            <w:tcW w:type="dxa" w:w="1368"/>
             <w:vAlign w:val="center"/>
             <w:tcMar>
               <w:top w:w="35" w:type="dxa"/>
@@ -1648,7 +1648,7 @@
         </w:tc>
         <w:tc>
           <w:tcPr>
-            <w:tcW w:type="dxa" w:w="1224"/>
+            <w:tcW w:type="dxa" w:w="1296"/>
             <w:vAlign w:val="center"/>
             <w:tcMar>
               <w:top w:w="35" w:type="dxa"/>
@@ -1675,7 +1675,7 @@
         </w:tc>
         <w:tc>
           <w:tcPr>
-            <w:tcW w:type="dxa" w:w="1152"/>
+            <w:tcW w:type="dxa" w:w="2016"/>
             <w:vAlign w:val="center"/>
             <w:tcMar>
               <w:top w:w="35" w:type="dxa"/>
@@ -1760,7 +1760,7 @@
         </w:tc>
         <w:tc>
           <w:tcPr>
-            <w:tcW w:type="dxa" w:w="936"/>
+            <w:tcW w:type="dxa" w:w="792"/>
             <w:vAlign w:val="center"/>
             <w:tcMar>
               <w:top w:w="35" w:type="dxa"/>
@@ -1787,7 +1787,7 @@
         </w:tc>
         <w:tc>
           <w:tcPr>
-            <w:tcW w:type="dxa" w:w="1008"/>
+            <w:tcW w:type="dxa" w:w="864"/>
             <w:vAlign w:val="center"/>
             <w:tcMar>
               <w:top w:w="35" w:type="dxa"/>
@@ -1814,7 +1814,7 @@
         </w:tc>
         <w:tc>
           <w:tcPr>
-            <w:tcW w:type="dxa" w:w="792"/>
+            <w:tcW w:type="dxa" w:w="720"/>
             <w:vAlign w:val="center"/>
             <w:tcMar>
               <w:top w:w="35" w:type="dxa"/>
@@ -1841,7 +1841,7 @@
         </w:tc>
         <w:tc>
           <w:tcPr>
-            <w:tcW w:type="dxa" w:w="1656"/>
+            <w:tcW w:type="dxa" w:w="1368"/>
             <w:vAlign w:val="center"/>
             <w:tcMar>
               <w:top w:w="35" w:type="dxa"/>
@@ -1870,7 +1870,7 @@
         </w:tc>
         <w:tc>
           <w:tcPr>
-            <w:tcW w:type="dxa" w:w="1656"/>
+            <w:tcW w:type="dxa" w:w="1368"/>
             <w:vAlign w:val="center"/>
             <w:tcMar>
               <w:top w:w="35" w:type="dxa"/>
@@ -1897,7 +1897,7 @@
         </w:tc>
         <w:tc>
           <w:tcPr>
-            <w:tcW w:type="dxa" w:w="1224"/>
+            <w:tcW w:type="dxa" w:w="1296"/>
             <w:vAlign w:val="center"/>
             <w:tcMar>
               <w:top w:w="35" w:type="dxa"/>
@@ -1924,7 +1924,7 @@
         </w:tc>
         <w:tc>
           <w:tcPr>
-            <w:tcW w:type="dxa" w:w="1152"/>
+            <w:tcW w:type="dxa" w:w="2016"/>
             <w:vAlign w:val="center"/>
             <w:tcMar>
               <w:top w:w="35" w:type="dxa"/>
@@ -2009,7 +2009,7 @@
         </w:tc>
         <w:tc>
           <w:tcPr>
-            <w:tcW w:type="dxa" w:w="936"/>
+            <w:tcW w:type="dxa" w:w="792"/>
             <w:vAlign w:val="center"/>
             <w:tcMar>
               <w:top w:w="35" w:type="dxa"/>
@@ -2036,7 +2036,7 @@
         </w:tc>
         <w:tc>
           <w:tcPr>
-            <w:tcW w:type="dxa" w:w="1008"/>
+            <w:tcW w:type="dxa" w:w="864"/>
             <w:vAlign w:val="center"/>
             <w:tcMar>
               <w:top w:w="35" w:type="dxa"/>
@@ -2063,7 +2063,7 @@
         </w:tc>
         <w:tc>
           <w:tcPr>
-            <w:tcW w:type="dxa" w:w="792"/>
+            <w:tcW w:type="dxa" w:w="720"/>
             <w:vAlign w:val="center"/>
             <w:tcMar>
               <w:top w:w="35" w:type="dxa"/>
@@ -2090,7 +2090,7 @@
         </w:tc>
         <w:tc>
           <w:tcPr>
-            <w:tcW w:type="dxa" w:w="1656"/>
+            <w:tcW w:type="dxa" w:w="1368"/>
             <w:vAlign w:val="center"/>
             <w:tcMar>
               <w:top w:w="35" w:type="dxa"/>
@@ -2119,7 +2119,7 @@
         </w:tc>
         <w:tc>
           <w:tcPr>
-            <w:tcW w:type="dxa" w:w="1656"/>
+            <w:tcW w:type="dxa" w:w="1368"/>
             <w:vAlign w:val="center"/>
             <w:tcMar>
               <w:top w:w="35" w:type="dxa"/>
@@ -2146,7 +2146,7 @@
         </w:tc>
         <w:tc>
           <w:tcPr>
-            <w:tcW w:type="dxa" w:w="1224"/>
+            <w:tcW w:type="dxa" w:w="1296"/>
             <w:vAlign w:val="center"/>
             <w:tcMar>
               <w:top w:w="35" w:type="dxa"/>
@@ -2173,7 +2173,7 @@
         </w:tc>
         <w:tc>
           <w:tcPr>
-            <w:tcW w:type="dxa" w:w="1152"/>
+            <w:tcW w:type="dxa" w:w="2016"/>
             <w:vAlign w:val="center"/>
             <w:tcMar>
               <w:top w:w="35" w:type="dxa"/>
@@ -2290,7 +2290,7 @@
         </w:tc>
         <w:tc>
           <w:tcPr>
-            <w:tcW w:type="dxa" w:w="936"/>
+            <w:tcW w:type="dxa" w:w="792"/>
             <w:vMerge w:val="restart"/>
             <w:vAlign w:val="center"/>
             <w:tcMar>
@@ -2318,7 +2318,7 @@
         </w:tc>
         <w:tc>
           <w:tcPr>
-            <w:tcW w:type="dxa" w:w="1008"/>
+            <w:tcW w:type="dxa" w:w="864"/>
             <w:vMerge w:val="restart"/>
             <w:vAlign w:val="center"/>
             <w:tcMar>
@@ -2346,7 +2346,7 @@
         </w:tc>
         <w:tc>
           <w:tcPr>
-            <w:tcW w:type="dxa" w:w="792"/>
+            <w:tcW w:type="dxa" w:w="720"/>
             <w:vMerge w:val="restart"/>
             <w:vAlign w:val="center"/>
             <w:tcMar>
@@ -2374,7 +2374,7 @@
         </w:tc>
         <w:tc>
           <w:tcPr>
-            <w:tcW w:type="dxa" w:w="1656"/>
+            <w:tcW w:type="dxa" w:w="1368"/>
             <w:vMerge w:val="restart"/>
             <w:vAlign w:val="center"/>
             <w:tcMar>
@@ -2402,7 +2402,7 @@
         </w:tc>
         <w:tc>
           <w:tcPr>
-            <w:tcW w:type="dxa" w:w="1656"/>
+            <w:tcW w:type="dxa" w:w="1368"/>
             <w:vAlign w:val="center"/>
             <w:tcMar>
               <w:top w:w="35" w:type="dxa"/>
@@ -2431,7 +2431,7 @@
         </w:tc>
         <w:tc>
           <w:tcPr>
-            <w:tcW w:type="dxa" w:w="1224"/>
+            <w:tcW w:type="dxa" w:w="1296"/>
             <w:vAlign w:val="center"/>
             <w:tcMar>
               <w:top w:w="35" w:type="dxa"/>
@@ -2460,7 +2460,7 @@
         </w:tc>
         <w:tc>
           <w:tcPr>
-            <w:tcW w:type="dxa" w:w="1152"/>
+            <w:tcW w:type="dxa" w:w="2016"/>
             <w:vAlign w:val="center"/>
             <w:tcMar>
               <w:top w:w="35" w:type="dxa"/>
@@ -2480,7 +2480,7 @@
                 <w:i/>
                 <w:sz w:val="12"/>
               </w:rPr>
-              <w:t>S. epidermidis</w:t>
+              <w:t>Staphylococcus epidermidis</w:t>
               <w:br/>
             </w:r>
             <w:r>
@@ -2559,7 +2559,7 @@
         </w:tc>
         <w:tc>
           <w:tcPr>
-            <w:tcW w:type="dxa" w:w="1656"/>
+            <w:tcW w:type="dxa" w:w="1368"/>
             <w:vAlign w:val="center"/>
             <w:tcMar>
               <w:top w:w="35" w:type="dxa"/>
@@ -2588,7 +2588,7 @@
         </w:tc>
         <w:tc>
           <w:tcPr>
-            <w:tcW w:type="dxa" w:w="1224"/>
+            <w:tcW w:type="dxa" w:w="1296"/>
             <w:vAlign w:val="center"/>
             <w:tcMar>
               <w:top w:w="35" w:type="dxa"/>
@@ -2617,7 +2617,7 @@
         </w:tc>
         <w:tc>
           <w:tcPr>
-            <w:tcW w:type="dxa" w:w="1152"/>
+            <w:tcW w:type="dxa" w:w="2016"/>
             <w:vAlign w:val="center"/>
             <w:tcMar>
               <w:top w:w="35" w:type="dxa"/>
@@ -2634,15 +2634,46 @@
             <w:r>
               <w:rPr>
                 <w:rFonts w:ascii="Times New Roman" w:hAnsi="Times New Roman"/>
-                <w:b w:val="0"/>
-                <w:i w:val="0"/>
-                <w:sz w:val="12"/>
+                <w:i/>
+                <w:sz w:val="11"/>
               </w:rPr>
-              <w:t>Gram (+) rods,</w:t>
+              <w:t>Staphylococcus epidermidis</w:t>
               <w:br/>
-              <w:t>Gram (-) rods,</w:t>
+            </w:r>
+            <w:r>
+              <w:rPr>
+                <w:rFonts w:ascii="Times New Roman" w:hAnsi="Times New Roman"/>
+                <w:i/>
+                <w:sz w:val="11"/>
+              </w:rPr>
+              <w:t>Pseudomonas parafulva</w:t>
               <w:br/>
-              <w:t>Gram (+) cocci</w:t>
+            </w:r>
+            <w:r>
+              <w:rPr>
+                <w:rFonts w:ascii="Times New Roman" w:hAnsi="Times New Roman"/>
+                <w:i/>
+                <w:sz w:val="11"/>
+              </w:rPr>
+              <w:t>Bacillus safensis</w:t>
+              <w:br/>
+            </w:r>
+            <w:r>
+              <w:rPr>
+                <w:rFonts w:ascii="Times New Roman" w:hAnsi="Times New Roman"/>
+                <w:i/>
+                <w:sz w:val="11"/>
+              </w:rPr>
+              <w:t>Corynebacterium xerosis</w:t>
+              <w:br/>
+            </w:r>
+            <w:r>
+              <w:rPr>
+                <w:rFonts w:ascii="Times New Roman" w:hAnsi="Times New Roman"/>
+                <w:i/>
+                <w:sz w:val="11"/>
+              </w:rPr>
+              <w:t>Corynebacterium ureicelerivorans</w:t>
             </w:r>
           </w:p>
         </w:tc>
@@ -2717,7 +2748,7 @@
         </w:tc>
         <w:tc>
           <w:tcPr>
-            <w:tcW w:type="dxa" w:w="936"/>
+            <w:tcW w:type="dxa" w:w="792"/>
             <w:vAlign w:val="center"/>
             <w:tcMar>
               <w:top w:w="35" w:type="dxa"/>
@@ -2744,7 +2775,7 @@
         </w:tc>
         <w:tc>
           <w:tcPr>
-            <w:tcW w:type="dxa" w:w="1008"/>
+            <w:tcW w:type="dxa" w:w="864"/>
             <w:vAlign w:val="center"/>
             <w:tcMar>
               <w:top w:w="35" w:type="dxa"/>
@@ -2771,7 +2802,7 @@
         </w:tc>
         <w:tc>
           <w:tcPr>
-            <w:tcW w:type="dxa" w:w="792"/>
+            <w:tcW w:type="dxa" w:w="720"/>
             <w:vAlign w:val="center"/>
             <w:tcMar>
               <w:top w:w="35" w:type="dxa"/>
@@ -2798,7 +2829,7 @@
         </w:tc>
         <w:tc>
           <w:tcPr>
-            <w:tcW w:type="dxa" w:w="1656"/>
+            <w:tcW w:type="dxa" w:w="1368"/>
             <w:vAlign w:val="center"/>
             <w:tcMar>
               <w:top w:w="35" w:type="dxa"/>
@@ -2825,7 +2856,7 @@
         </w:tc>
         <w:tc>
           <w:tcPr>
-            <w:tcW w:type="dxa" w:w="1656"/>
+            <w:tcW w:type="dxa" w:w="1368"/>
             <w:vAlign w:val="center"/>
             <w:tcMar>
               <w:top w:w="35" w:type="dxa"/>
@@ -2852,7 +2883,7 @@
         </w:tc>
         <w:tc>
           <w:tcPr>
-            <w:tcW w:type="dxa" w:w="1224"/>
+            <w:tcW w:type="dxa" w:w="1296"/>
             <w:vAlign w:val="center"/>
             <w:tcMar>
               <w:top w:w="35" w:type="dxa"/>
@@ -2879,7 +2910,7 @@
         </w:tc>
         <w:tc>
           <w:tcPr>
-            <w:tcW w:type="dxa" w:w="1152"/>
+            <w:tcW w:type="dxa" w:w="2016"/>
             <w:vAlign w:val="center"/>
             <w:tcMar>
               <w:top w:w="35" w:type="dxa"/>

</xml_diff>

<commit_message>
feat(rules): codify Robin Seymour QA review standards, L-Suite layout, and event count verification (Rule 0X & PRD Rule 70)
</commit_message>
<xml_diff>
--- a/Tables OOS-262289 Link Pharmacy (E19112) - ScanRDI.docx
+++ b/Tables OOS-262289 Link Pharmacy (E19112) - ScanRDI.docx
@@ -295,16 +295,8 @@
             <w:vAlign w:val="center"/>
           </w:tcPr>
           <w:p>
-            <w:pPr>
-              <w:spacing w:after="0" w:line="240" w:lineRule="auto"/>
-              <w:jc w:val="center"/>
-            </w:pPr>
             <w:r>
-              <w:rPr>
-                <w:rFonts w:ascii="Times New Roman" w:hAnsi="Times New Roman"/>
-                <w:sz w:val="14"/>
-              </w:rPr>
-              <w:t>15</w:t>
+              <w:t>19</w:t>
             </w:r>
           </w:p>
         </w:tc>

</xml_diff>